<commit_message>
Added more data, created 10 and 11 notebooks to treat this data, check and clean;  reapply models. Started a new report eda analysis focusing on business useful info
</commit_message>
<xml_diff>
--- a/doc/Informe_proyecto_prediccion_retrasos_vuelos.docx
+++ b/doc/Informe_proyecto_prediccion_retrasos_vuelos.docx
@@ -88,7 +88,7 @@
           <w:color w:val="68727D"/>
           <w:sz w:val="20"/>
         </w:rPr>
-        <w:t>Versión 1.0  ·  9 de agosto de 2026</w:t>
+        <w:t>Versión 1.1  ·  13 de agosto de 2026</w:t>
       </w:r>
     </w:p>
     <w:p>
@@ -285,7 +285,7 @@
                 <w:color w:val="1F4D78"/>
                 <w:sz w:val="17"/>
               </w:rPr>
-              <w:t>Ampliar EUROCONTROL de un mes a seis periodos</w:t>
+              <w:t>Ampliar EUROCONTROL de un mes a nueve periodos</w:t>
             </w:r>
           </w:p>
         </w:tc>
@@ -335,7 +335,7 @@
                 <w:rFonts w:ascii="Calibri" w:hAnsi="Calibri"/>
                 <w:sz w:val="17"/>
               </w:rPr>
-              <w:t>4.115.663 vuelos brutos entre dic-2021 y mar-2023.</w:t>
+              <w:t>6.099.999 vuelos brutos entre jun-2021 y jun-2023.</w:t>
             </w:r>
           </w:p>
         </w:tc>
@@ -587,7 +587,7 @@
                 <w:rFonts w:ascii="Calibri" w:hAnsi="Calibri"/>
                 <w:sz w:val="17"/>
               </w:rPr>
-              <w:t>3.671.258 vuelos limpios para modelado.</w:t>
+              <w:t>La regla se conserva; el nuevo conteo limpio se calculará al ejecutar notebook 10 completa.</w:t>
             </w:r>
           </w:p>
         </w:tc>
@@ -669,7 +669,7 @@
                 <w:rFonts w:ascii="Calibri" w:hAnsi="Calibri"/>
                 <w:sz w:val="17"/>
               </w:rPr>
-              <w:t>Train hasta sep-2022; validación dic-2022; test mar-2023.</w:t>
+              <w:t>Train hasta sep-2022; validación dic-2022; tests mar-2023 y jun-2023.</w:t>
             </w:r>
           </w:p>
         </w:tc>
@@ -1163,7 +1163,7 @@
         <w:pStyle w:val="Heading2"/>
       </w:pPr>
       <w:r>
-        <w:t>De un mes a seis periodos</w:t>
+        <w:t>De un mes a nueve periodos</w:t>
       </w:r>
     </w:p>
     <w:p>
@@ -1171,7 +1171,7 @@
         <w:widowControl/>
       </w:pPr>
       <w:r>
-        <w:t>El primer análisis se hizo con diciembre de 2021: 570.200 vuelos. Era suficiente para entender columnas, nulos y distribuciones, pero no para confiar en la generalización. Por eso no se cambió a una fuente distinta: se añadieron más periodos de la misma fuente, espaciados para cubrir estaciones y cambios de volumen.</w:t>
+        <w:t>El primer análisis se hizo con diciembre de 2021: 570.200 vuelos. Era suficiente para entender columnas, nulos y distribuciones, pero no para confiar en la generalización. Se mantuvo la misma fuente y se añadieron junio y septiembre de 2021 y junio de 2023. El conjunto ampliado contiene 6.099.999 vuelos brutos en nueve cortes mensuales.</w:t>
       </w:r>
     </w:p>
     <w:p>
@@ -1220,7 +1220,7 @@
         <w:pStyle w:val="Caption"/>
       </w:pPr>
       <w:r>
-        <w:t>Figura 1. Seis periodos mensuales suman 4.115.663 vuelos. Son cortes estacionales, no un calendario continuo.</w:t>
+        <w:t>Figura 1. Nueve periodos mensuales suman 6.099.999 vuelos. Son cortes estacionales, no un calendario continuo.</w:t>
       </w:r>
     </w:p>
     <w:tbl>
@@ -1255,7 +1255,6 @@
           </w:tcPr>
           <w:p>
             <w:pPr>
-              <w:keepNext/>
               <w:spacing w:after="0"/>
               <w:jc w:val="left"/>
             </w:pPr>
@@ -1284,7 +1283,6 @@
           </w:tcPr>
           <w:p>
             <w:pPr>
-              <w:keepNext/>
               <w:spacing w:after="0"/>
               <w:jc w:val="left"/>
             </w:pPr>
@@ -1313,7 +1311,6 @@
           </w:tcPr>
           <w:p>
             <w:pPr>
-              <w:keepNext/>
               <w:spacing w:after="0"/>
               <w:jc w:val="left"/>
             </w:pPr>
@@ -1346,7 +1343,6 @@
           </w:tcPr>
           <w:p>
             <w:pPr>
-              <w:keepNext/>
               <w:spacing w:after="0" w:line="259" w:lineRule="auto"/>
             </w:pPr>
             <w:r>
@@ -1354,7 +1350,7 @@
                 <w:rFonts w:ascii="Calibri" w:hAnsi="Calibri"/>
                 <w:sz w:val="18"/>
               </w:rPr>
-              <w:t>dic-2021</w:t>
+              <w:t>jun-2021</w:t>
             </w:r>
           </w:p>
         </w:tc>
@@ -1371,7 +1367,6 @@
           </w:tcPr>
           <w:p>
             <w:pPr>
-              <w:keepNext/>
               <w:spacing w:after="0" w:line="259" w:lineRule="auto"/>
             </w:pPr>
             <w:r>
@@ -1379,7 +1374,7 @@
                 <w:rFonts w:ascii="Calibri" w:hAnsi="Calibri"/>
                 <w:sz w:val="18"/>
               </w:rPr>
-              <w:t>570.200</w:t>
+              <w:t>447.215</w:t>
             </w:r>
           </w:p>
         </w:tc>
@@ -1396,7 +1391,6 @@
           </w:tcPr>
           <w:p>
             <w:pPr>
-              <w:keepNext/>
               <w:spacing w:after="0" w:line="259" w:lineRule="auto"/>
             </w:pPr>
             <w:r>
@@ -1427,7 +1421,6 @@
           </w:tcPr>
           <w:p>
             <w:pPr>
-              <w:keepNext/>
               <w:spacing w:after="0" w:line="259" w:lineRule="auto"/>
             </w:pPr>
             <w:r>
@@ -1435,7 +1428,7 @@
                 <w:rFonts w:ascii="Calibri" w:hAnsi="Calibri"/>
                 <w:sz w:val="18"/>
               </w:rPr>
-              <w:t>mar-2022</w:t>
+              <w:t>sep-2021</w:t>
             </w:r>
           </w:p>
         </w:tc>
@@ -1453,7 +1446,6 @@
           </w:tcPr>
           <w:p>
             <w:pPr>
-              <w:keepNext/>
               <w:spacing w:after="0" w:line="259" w:lineRule="auto"/>
             </w:pPr>
             <w:r>
@@ -1461,7 +1453,7 @@
                 <w:rFonts w:ascii="Calibri" w:hAnsi="Calibri"/>
                 <w:sz w:val="18"/>
               </w:rPr>
-              <w:t>576.258</w:t>
+              <w:t>652.298</w:t>
             </w:r>
           </w:p>
         </w:tc>
@@ -1479,7 +1471,6 @@
           </w:tcPr>
           <w:p>
             <w:pPr>
-              <w:keepNext/>
               <w:spacing w:after="0" w:line="259" w:lineRule="auto"/>
             </w:pPr>
             <w:r>
@@ -1509,7 +1500,6 @@
           </w:tcPr>
           <w:p>
             <w:pPr>
-              <w:keepNext/>
               <w:spacing w:after="0" w:line="259" w:lineRule="auto"/>
             </w:pPr>
             <w:r>
@@ -1517,7 +1507,7 @@
                 <w:rFonts w:ascii="Calibri" w:hAnsi="Calibri"/>
                 <w:sz w:val="18"/>
               </w:rPr>
-              <w:t>jun-2022</w:t>
+              <w:t>dic-2021</w:t>
             </w:r>
           </w:p>
         </w:tc>
@@ -1534,7 +1524,6 @@
           </w:tcPr>
           <w:p>
             <w:pPr>
-              <w:keepNext/>
               <w:spacing w:after="0" w:line="259" w:lineRule="auto"/>
             </w:pPr>
             <w:r>
@@ -1542,7 +1531,7 @@
                 <w:rFonts w:ascii="Calibri" w:hAnsi="Calibri"/>
                 <w:sz w:val="18"/>
               </w:rPr>
-              <w:t>813.452</w:t>
+              <w:t>570.200</w:t>
             </w:r>
           </w:p>
         </w:tc>
@@ -1559,7 +1548,6 @@
           </w:tcPr>
           <w:p>
             <w:pPr>
-              <w:keepNext/>
               <w:spacing w:after="0" w:line="259" w:lineRule="auto"/>
             </w:pPr>
             <w:r>
@@ -1590,7 +1578,6 @@
           </w:tcPr>
           <w:p>
             <w:pPr>
-              <w:keepNext/>
               <w:spacing w:after="0" w:line="259" w:lineRule="auto"/>
             </w:pPr>
             <w:r>
@@ -1598,7 +1585,7 @@
                 <w:rFonts w:ascii="Calibri" w:hAnsi="Calibri"/>
                 <w:sz w:val="18"/>
               </w:rPr>
-              <w:t>sep-2022</w:t>
+              <w:t>mar-2022</w:t>
             </w:r>
           </w:p>
         </w:tc>
@@ -1616,7 +1603,6 @@
           </w:tcPr>
           <w:p>
             <w:pPr>
-              <w:keepNext/>
               <w:spacing w:after="0" w:line="259" w:lineRule="auto"/>
             </w:pPr>
             <w:r>
@@ -1624,7 +1610,7 @@
                 <w:rFonts w:ascii="Calibri" w:hAnsi="Calibri"/>
                 <w:sz w:val="18"/>
               </w:rPr>
-              <w:t>826.994</w:t>
+              <w:t>576.258</w:t>
             </w:r>
           </w:p>
         </w:tc>
@@ -1642,7 +1628,6 @@
           </w:tcPr>
           <w:p>
             <w:pPr>
-              <w:keepNext/>
               <w:spacing w:after="0" w:line="259" w:lineRule="auto"/>
             </w:pPr>
             <w:r>
@@ -1672,7 +1657,6 @@
           </w:tcPr>
           <w:p>
             <w:pPr>
-              <w:keepNext/>
               <w:spacing w:after="0" w:line="259" w:lineRule="auto"/>
             </w:pPr>
             <w:r>
@@ -1680,7 +1664,7 @@
                 <w:rFonts w:ascii="Calibri" w:hAnsi="Calibri"/>
                 <w:sz w:val="18"/>
               </w:rPr>
-              <w:t>dic-2022</w:t>
+              <w:t>jun-2022</w:t>
             </w:r>
           </w:p>
         </w:tc>
@@ -1697,7 +1681,6 @@
           </w:tcPr>
           <w:p>
             <w:pPr>
-              <w:keepNext/>
               <w:spacing w:after="0" w:line="259" w:lineRule="auto"/>
             </w:pPr>
             <w:r>
@@ -1705,7 +1688,7 @@
                 <w:rFonts w:ascii="Calibri" w:hAnsi="Calibri"/>
                 <w:sz w:val="18"/>
               </w:rPr>
-              <w:t>646.840</w:t>
+              <w:t>813.452</w:t>
             </w:r>
           </w:p>
         </w:tc>
@@ -1722,7 +1705,6 @@
           </w:tcPr>
           <w:p>
             <w:pPr>
-              <w:keepNext/>
               <w:spacing w:after="0" w:line="259" w:lineRule="auto"/>
             </w:pPr>
             <w:r>
@@ -1730,7 +1712,7 @@
                 <w:rFonts w:ascii="Calibri" w:hAnsi="Calibri"/>
                 <w:sz w:val="18"/>
               </w:rPr>
-              <w:t>Validación</w:t>
+              <w:t>Entrenamiento</w:t>
             </w:r>
           </w:p>
         </w:tc>
@@ -1760,7 +1742,7 @@
                 <w:rFonts w:ascii="Calibri" w:hAnsi="Calibri"/>
                 <w:sz w:val="18"/>
               </w:rPr>
-              <w:t>mar-2023</w:t>
+              <w:t>sep-2022</w:t>
             </w:r>
           </w:p>
         </w:tc>
@@ -1785,7 +1767,7 @@
                 <w:rFonts w:ascii="Calibri" w:hAnsi="Calibri"/>
                 <w:sz w:val="18"/>
               </w:rPr>
-              <w:t>681.919</w:t>
+              <w:t>826.994</w:t>
             </w:r>
           </w:p>
         </w:tc>
@@ -1810,7 +1792,241 @@
                 <w:rFonts w:ascii="Calibri" w:hAnsi="Calibri"/>
                 <w:sz w:val="18"/>
               </w:rPr>
+              <w:t>Entrenamiento</w:t>
+            </w:r>
+          </w:p>
+        </w:tc>
+      </w:tr>
+      <w:tr>
+        <w:trPr>
+          <w:cantSplit/>
+        </w:trPr>
+        <w:tc>
+          <w:tcPr>
+            <w:tcW w:type="dxa" w:w="1800"/>
+            <w:tcMar>
+              <w:top w:w="80" w:type="dxa"/>
+              <w:start w:w="120" w:type="dxa"/>
+              <w:bottom w:w="80" w:type="dxa"/>
+              <w:end w:w="120" w:type="dxa"/>
+            </w:tcMar>
+            <w:vAlign w:val="top"/>
+          </w:tcPr>
+          <w:p>
+            <w:pPr>
+              <w:spacing w:after="0" w:line="259" w:lineRule="auto"/>
+            </w:pPr>
+            <w:r>
+              <w:rPr>
+                <w:rFonts w:ascii="Calibri" w:hAnsi="Calibri"/>
+                <w:sz w:val="18"/>
+              </w:rPr>
+              <w:t>dic-2022</w:t>
+            </w:r>
+          </w:p>
+        </w:tc>
+        <w:tc>
+          <w:tcPr>
+            <w:tcW w:type="dxa" w:w="1800"/>
+            <w:tcMar>
+              <w:top w:w="80" w:type="dxa"/>
+              <w:start w:w="120" w:type="dxa"/>
+              <w:bottom w:w="80" w:type="dxa"/>
+              <w:end w:w="120" w:type="dxa"/>
+            </w:tcMar>
+            <w:vAlign w:val="top"/>
+          </w:tcPr>
+          <w:p>
+            <w:pPr>
+              <w:spacing w:after="0" w:line="259" w:lineRule="auto"/>
+            </w:pPr>
+            <w:r>
+              <w:rPr>
+                <w:rFonts w:ascii="Calibri" w:hAnsi="Calibri"/>
+                <w:sz w:val="18"/>
+              </w:rPr>
+              <w:t>646.840</w:t>
+            </w:r>
+          </w:p>
+        </w:tc>
+        <w:tc>
+          <w:tcPr>
+            <w:tcW w:type="dxa" w:w="5760"/>
+            <w:tcMar>
+              <w:top w:w="80" w:type="dxa"/>
+              <w:start w:w="120" w:type="dxa"/>
+              <w:bottom w:w="80" w:type="dxa"/>
+              <w:end w:w="120" w:type="dxa"/>
+            </w:tcMar>
+            <w:vAlign w:val="top"/>
+          </w:tcPr>
+          <w:p>
+            <w:pPr>
+              <w:spacing w:after="0" w:line="259" w:lineRule="auto"/>
+            </w:pPr>
+            <w:r>
+              <w:rPr>
+                <w:rFonts w:ascii="Calibri" w:hAnsi="Calibri"/>
+                <w:sz w:val="18"/>
+              </w:rPr>
+              <w:t>Validación</w:t>
+            </w:r>
+          </w:p>
+        </w:tc>
+      </w:tr>
+      <w:tr>
+        <w:trPr>
+          <w:cantSplit/>
+        </w:trPr>
+        <w:tc>
+          <w:tcPr>
+            <w:tcW w:type="dxa" w:w="1800"/>
+            <w:tcMar>
+              <w:top w:w="80" w:type="dxa"/>
+              <w:start w:w="120" w:type="dxa"/>
+              <w:bottom w:w="80" w:type="dxa"/>
+              <w:end w:w="120" w:type="dxa"/>
+            </w:tcMar>
+            <w:shd w:fill="F4F6F9"/>
+            <w:vAlign w:val="top"/>
+          </w:tcPr>
+          <w:p>
+            <w:pPr>
+              <w:spacing w:after="0" w:line="259" w:lineRule="auto"/>
+            </w:pPr>
+            <w:r>
+              <w:rPr>
+                <w:rFonts w:ascii="Calibri" w:hAnsi="Calibri"/>
+                <w:sz w:val="18"/>
+              </w:rPr>
+              <w:t>mar-2023</w:t>
+            </w:r>
+          </w:p>
+        </w:tc>
+        <w:tc>
+          <w:tcPr>
+            <w:tcW w:type="dxa" w:w="1800"/>
+            <w:tcMar>
+              <w:top w:w="80" w:type="dxa"/>
+              <w:start w:w="120" w:type="dxa"/>
+              <w:bottom w:w="80" w:type="dxa"/>
+              <w:end w:w="120" w:type="dxa"/>
+            </w:tcMar>
+            <w:shd w:fill="F4F6F9"/>
+            <w:vAlign w:val="top"/>
+          </w:tcPr>
+          <w:p>
+            <w:pPr>
+              <w:spacing w:after="0" w:line="259" w:lineRule="auto"/>
+            </w:pPr>
+            <w:r>
+              <w:rPr>
+                <w:rFonts w:ascii="Calibri" w:hAnsi="Calibri"/>
+                <w:sz w:val="18"/>
+              </w:rPr>
+              <w:t>681.919</w:t>
+            </w:r>
+          </w:p>
+        </w:tc>
+        <w:tc>
+          <w:tcPr>
+            <w:tcW w:type="dxa" w:w="5760"/>
+            <w:tcMar>
+              <w:top w:w="80" w:type="dxa"/>
+              <w:start w:w="120" w:type="dxa"/>
+              <w:bottom w:w="80" w:type="dxa"/>
+              <w:end w:w="120" w:type="dxa"/>
+            </w:tcMar>
+            <w:shd w:fill="F4F6F9"/>
+            <w:vAlign w:val="top"/>
+          </w:tcPr>
+          <w:p>
+            <w:pPr>
+              <w:spacing w:after="0" w:line="259" w:lineRule="auto"/>
+            </w:pPr>
+            <w:r>
+              <w:rPr>
+                <w:rFonts w:ascii="Calibri" w:hAnsi="Calibri"/>
+                <w:sz w:val="18"/>
+              </w:rPr>
               <w:t>Test</w:t>
+            </w:r>
+          </w:p>
+        </w:tc>
+      </w:tr>
+      <w:tr>
+        <w:trPr>
+          <w:cantSplit/>
+        </w:trPr>
+        <w:tc>
+          <w:tcPr>
+            <w:tcW w:type="dxa" w:w="1800"/>
+            <w:tcMar>
+              <w:top w:w="80" w:type="dxa"/>
+              <w:start w:w="120" w:type="dxa"/>
+              <w:bottom w:w="80" w:type="dxa"/>
+              <w:end w:w="120" w:type="dxa"/>
+            </w:tcMar>
+            <w:vAlign w:val="top"/>
+          </w:tcPr>
+          <w:p>
+            <w:pPr>
+              <w:spacing w:after="0" w:line="259" w:lineRule="auto"/>
+            </w:pPr>
+            <w:r>
+              <w:rPr>
+                <w:rFonts w:ascii="Calibri" w:hAnsi="Calibri"/>
+                <w:sz w:val="18"/>
+              </w:rPr>
+              <w:t>jun-2023</w:t>
+            </w:r>
+          </w:p>
+        </w:tc>
+        <w:tc>
+          <w:tcPr>
+            <w:tcW w:type="dxa" w:w="1800"/>
+            <w:tcMar>
+              <w:top w:w="80" w:type="dxa"/>
+              <w:start w:w="120" w:type="dxa"/>
+              <w:bottom w:w="80" w:type="dxa"/>
+              <w:end w:w="120" w:type="dxa"/>
+            </w:tcMar>
+            <w:vAlign w:val="top"/>
+          </w:tcPr>
+          <w:p>
+            <w:pPr>
+              <w:spacing w:after="0" w:line="259" w:lineRule="auto"/>
+            </w:pPr>
+            <w:r>
+              <w:rPr>
+                <w:rFonts w:ascii="Calibri" w:hAnsi="Calibri"/>
+                <w:sz w:val="18"/>
+              </w:rPr>
+              <w:t>884.823</w:t>
+            </w:r>
+          </w:p>
+        </w:tc>
+        <w:tc>
+          <w:tcPr>
+            <w:tcW w:type="dxa" w:w="5760"/>
+            <w:tcMar>
+              <w:top w:w="80" w:type="dxa"/>
+              <w:start w:w="120" w:type="dxa"/>
+              <w:bottom w:w="80" w:type="dxa"/>
+              <w:end w:w="120" w:type="dxa"/>
+            </w:tcMar>
+            <w:vAlign w:val="top"/>
+          </w:tcPr>
+          <w:p>
+            <w:pPr>
+              <w:spacing w:after="0" w:line="259" w:lineRule="auto"/>
+            </w:pPr>
+            <w:r>
+              <w:rPr>
+                <w:rFonts w:ascii="Calibri" w:hAnsi="Calibri"/>
+                <w:sz w:val="18"/>
+              </w:rPr>
+              <w:t>Test futuro</w:t>
             </w:r>
           </w:p>
         </w:tc>
@@ -1821,6 +2037,22 @@
         <w:widowControl/>
         <w:spacing w:after="0"/>
       </w:pPr>
+    </w:p>
+    <w:p>
+      <w:pPr>
+        <w:pStyle w:val="Heading2"/>
+      </w:pPr>
+      <w:r>
+        <w:t>Compatibilidad y nulos de los nuevos datos</w:t>
+      </w:r>
+    </w:p>
+    <w:p>
+      <w:pPr>
+        <w:widowControl/>
+      </w:pPr>
+      <w:r>
+        <w:t>Los nueve archivos conservan exactamente las mismas 18 columnas. La auditoría completa por bloques no detectó cambios materiales de nulos superiores a 2 puntos porcentuales. La mayor diferencia fue AC Registration: 0,203% en los archivos de referencia frente a 0,249% en los nuevos, solo +0,046 puntos. Las reglas de limpieza e imputación pueden mantenerse.</w:t>
+      </w:r>
     </w:p>
     <w:p>
       <w:pPr>
@@ -2728,7 +2960,7 @@
         <w:widowControl/>
       </w:pPr>
       <w:r>
-        <w:t>La limpieza se implementó con PySpark para procesar los 4,1 millones de filas de forma reproducible. De los datos brutos, 3.671.885 vuelos pertenecían al alcance regular programado y 3.671.258 quedaron después de las reglas físicas. Por tanto, casi toda la reducción (443.778 vuelos) procede de definir la población, no de borrar observaciones por comodidad.</w:t>
+        <w:t>La limpieza se implementó con PySpark y mantiene el mismo esquema de reglas al ampliar de 4,1 a 6,1 millones de filas brutas. Los conteos limpios anteriores siguen documentando la primera ejecución, pero el nuevo total se recalculará en la notebook 10 completa para no mezclar cifras de dos versiones del dataset.</w:t>
       </w:r>
     </w:p>
     <w:tbl>
@@ -11133,7 +11365,7 @@
         <w:widowControl/>
       </w:pPr>
       <w:r>
-        <w:t>No es la siguiente prioridad. CNN/LSTM cobra más sentido cuando hay secuencias densas y continuas por aeropuerto, ruta o aeronave. Los datos actuales son principalmente tabulares y seis cortes mensuales. Primero conviene conseguir meses consecutivos, construir secuencias sin huecos y comparar contra Ridge/CatBoost con el mismo split. Solo entonces se justificaría su mayor coste y complejidad.</w:t>
+        <w:t>No es la siguiente prioridad. CNN/LSTM cobra más sentido cuando hay secuencias densas y continuas por aeropuerto, ruta o aeronave. Los datos actuales son principalmente tabulares y nueve cortes mensuales no consecutivos. Primero conviene conseguir meses consecutivos, construir secuencias sin huecos y comparar contra Ridge/CatBoost con el mismo split. Solo entonces se justificaría su mayor coste y complejidad.</w:t>
       </w:r>
     </w:p>
     <w:p>
@@ -11935,7 +12167,7 @@
         <w:widowControl/>
       </w:pPr>
       <w:r>
-        <w:t>Libretas 01_initial_analysis_sample a 08_arrival_pre_t60_operational_features; configuración compartida en src/flight_config.py; pipeline Spark en src/spark_flight_pipeline.py; salidas ejecutadas y gráficos de la carpeta reports. Las cifras de este informe proceden de esas ejecuciones locales.</w:t>
+        <w:t>Libretas 01_initial_analysis_sample a 11_expanded_arrival_pre_models_prediction; configuración compartida en src/flight_config.py; catálogo en src/flight_data_catalog.py; pipeline Spark en src/spark_flight_pipeline.py; salidas de auditoría y gráficos de reports. Las métricas de modelos mostradas siguen correspondiendo al pipeline anterior hasta que se ejecute el entrenamiento ampliado; no deben atribuirse todavía a los nueve meses.</w:t>
       </w:r>
     </w:p>
     <w:sectPr>

</xml_diff>